<commit_message>
Se incluye documento de explicacion
</commit_message>
<xml_diff>
--- a/Semana02/Carrito_POO_Explicacion.docx
+++ b/Semana02/Carrito_POO_Explicacion.docx
@@ -2278,7 +2278,552 @@
           <w:sz w:val="22"/>
           <w:szCs w:val="22"/>
         </w:rPr>
-        <w:t xml:space="preserve">Siguiendo la indicación de no trabajar sobre main, se creó la rama feature/carrito-poo y el código se registró en tres commits ordenados por capas: primero el modelo de dominio (Producto, ItemCarrito, Cliente), luego la lógica de negocio (Carrito, Descuento, Recibo) y finalmente la orquestación (Tienda, mainCarrito). La rama quedó activa en el repositorio local; el push a GitHub debe ejecutarse desde tu máquina con:</w:t>
+        <w:t xml:space="preserve">Siguiendo la indicación de no trabajar sobre main, se creó la rama feature/carrito-poo y el trabajo POO quedó registrado en ocho commits progresivos, ordenados por capas y por funcionalidad:</w:t>
+      </w:r>
+    </w:p>
+    <w:p>
+      <w:pPr>
+        <w:spacing w:after="120"/>
+      </w:pPr>
+    </w:p>
+    <w:tbl>
+      <w:tblPr>
+        <w:tblW w:type="dxa" w:w="9360"/>
+        <w:tblBorders>
+          <w:top w:val="single" w:color="auto" w:sz="4"/>
+          <w:left w:val="single" w:color="auto" w:sz="4"/>
+          <w:bottom w:val="single" w:color="auto" w:sz="4"/>
+          <w:right w:val="single" w:color="auto" w:sz="4"/>
+          <w:insideH w:val="single" w:color="auto" w:sz="4"/>
+          <w:insideV w:val="single" w:color="auto" w:sz="4"/>
+        </w:tblBorders>
+      </w:tblPr>
+      <w:tblGrid>
+        <w:gridCol w:w="1200"/>
+        <w:gridCol w:w="8160"/>
+      </w:tblGrid>
+      <w:tr>
+        <w:tc>
+          <w:tcPr>
+            <w:tcW w:type="dxa" w:w="1200"/>
+            <w:shd w:fill="1F4E79" w:val="clear"/>
+            <w:tcMar>
+              <w:top w:type="dxa" w:w="80"/>
+              <w:left w:type="dxa" w:w="120"/>
+              <w:bottom w:type="dxa" w:w="80"/>
+              <w:right w:type="dxa" w:w="120"/>
+            </w:tcMar>
+          </w:tcPr>
+          <w:p>
+            <w:pPr>
+              <w:spacing w:after="0"/>
+            </w:pPr>
+            <w:r>
+              <w:rPr>
+                <w:rFonts w:ascii="Calibri" w:cs="Calibri" w:eastAsia="Calibri" w:hAnsi="Calibri"/>
+                <w:b/>
+                <w:bCs/>
+                <w:color w:val="FFFFFF"/>
+                <w:sz w:val="20"/>
+                <w:szCs w:val="20"/>
+              </w:rPr>
+              <w:t xml:space="preserve">N°</w:t>
+            </w:r>
+          </w:p>
+        </w:tc>
+        <w:tc>
+          <w:tcPr>
+            <w:tcW w:type="dxa" w:w="8160"/>
+            <w:shd w:fill="1F4E79" w:val="clear"/>
+            <w:tcMar>
+              <w:top w:type="dxa" w:w="80"/>
+              <w:left w:type="dxa" w:w="120"/>
+              <w:bottom w:type="dxa" w:w="80"/>
+              <w:right w:type="dxa" w:w="120"/>
+            </w:tcMar>
+          </w:tcPr>
+          <w:p>
+            <w:pPr>
+              <w:spacing w:after="0"/>
+            </w:pPr>
+            <w:r>
+              <w:rPr>
+                <w:rFonts w:ascii="Calibri" w:cs="Calibri" w:eastAsia="Calibri" w:hAnsi="Calibri"/>
+                <w:b/>
+                <w:bCs/>
+                <w:color w:val="FFFFFF"/>
+                <w:sz w:val="20"/>
+                <w:szCs w:val="20"/>
+              </w:rPr>
+              <w:t xml:space="preserve">Commit</w:t>
+            </w:r>
+          </w:p>
+        </w:tc>
+      </w:tr>
+      <w:tr>
+        <w:tc>
+          <w:tcPr>
+            <w:tcW w:type="dxa" w:w="1200"/>
+            <w:tcMar>
+              <w:top w:type="dxa" w:w="80"/>
+              <w:left w:type="dxa" w:w="120"/>
+              <w:bottom w:type="dxa" w:w="80"/>
+              <w:right w:type="dxa" w:w="120"/>
+            </w:tcMar>
+          </w:tcPr>
+          <w:p>
+            <w:pPr>
+              <w:spacing w:after="0"/>
+            </w:pPr>
+            <w:r>
+              <w:rPr>
+                <w:rFonts w:ascii="Calibri" w:cs="Calibri" w:eastAsia="Calibri" w:hAnsi="Calibri"/>
+                <w:b w:val="false"/>
+                <w:bCs w:val="false"/>
+                <w:sz w:val="20"/>
+                <w:szCs w:val="20"/>
+              </w:rPr>
+              <w:t xml:space="preserve">1</w:t>
+            </w:r>
+          </w:p>
+        </w:tc>
+        <w:tc>
+          <w:tcPr>
+            <w:tcW w:type="dxa" w:w="8160"/>
+            <w:tcMar>
+              <w:top w:type="dxa" w:w="80"/>
+              <w:left w:type="dxa" w:w="120"/>
+              <w:bottom w:type="dxa" w:w="80"/>
+              <w:right w:type="dxa" w:w="120"/>
+            </w:tcMar>
+          </w:tcPr>
+          <w:p>
+            <w:pPr>
+              <w:spacing w:after="0"/>
+            </w:pPr>
+            <w:r>
+              <w:rPr>
+                <w:rFonts w:ascii="Calibri" w:cs="Calibri" w:eastAsia="Calibri" w:hAnsi="Calibri"/>
+                <w:b w:val="false"/>
+                <w:bCs w:val="false"/>
+                <w:sz w:val="20"/>
+                <w:szCs w:val="20"/>
+              </w:rPr>
+              <w:t xml:space="preserve">POO: modelo de dominio (Producto abstracto con herencia, ItemCarrito y Cliente encapsulados)</w:t>
+            </w:r>
+          </w:p>
+        </w:tc>
+      </w:tr>
+      <w:tr>
+        <w:tc>
+          <w:tcPr>
+            <w:tcW w:type="dxa" w:w="1200"/>
+            <w:tcMar>
+              <w:top w:type="dxa" w:w="80"/>
+              <w:left w:type="dxa" w:w="120"/>
+              <w:bottom w:type="dxa" w:w="80"/>
+              <w:right w:type="dxa" w:w="120"/>
+            </w:tcMar>
+          </w:tcPr>
+          <w:p>
+            <w:pPr>
+              <w:spacing w:after="0"/>
+            </w:pPr>
+            <w:r>
+              <w:rPr>
+                <w:rFonts w:ascii="Calibri" w:cs="Calibri" w:eastAsia="Calibri" w:hAnsi="Calibri"/>
+                <w:b w:val="false"/>
+                <w:bCs w:val="false"/>
+                <w:sz w:val="20"/>
+                <w:szCs w:val="20"/>
+              </w:rPr>
+              <w:t xml:space="preserve">2</w:t>
+            </w:r>
+          </w:p>
+        </w:tc>
+        <w:tc>
+          <w:tcPr>
+            <w:tcW w:type="dxa" w:w="8160"/>
+            <w:tcMar>
+              <w:top w:type="dxa" w:w="80"/>
+              <w:left w:type="dxa" w:w="120"/>
+              <w:bottom w:type="dxa" w:w="80"/>
+              <w:right w:type="dxa" w:w="120"/>
+            </w:tcMar>
+          </w:tcPr>
+          <w:p>
+            <w:pPr>
+              <w:spacing w:after="0"/>
+            </w:pPr>
+            <w:r>
+              <w:rPr>
+                <w:rFonts w:ascii="Calibri" w:cs="Calibri" w:eastAsia="Calibri" w:hAnsi="Calibri"/>
+                <w:b w:val="false"/>
+                <w:bCs w:val="false"/>
+                <w:sz w:val="20"/>
+                <w:szCs w:val="20"/>
+              </w:rPr>
+              <w:t xml:space="preserve">POO: logica de negocio (Carrito, interfaz CalculadoraDescuento y Recibo)</w:t>
+            </w:r>
+          </w:p>
+        </w:tc>
+      </w:tr>
+      <w:tr>
+        <w:tc>
+          <w:tcPr>
+            <w:tcW w:type="dxa" w:w="1200"/>
+            <w:tcMar>
+              <w:top w:type="dxa" w:w="80"/>
+              <w:left w:type="dxa" w:w="120"/>
+              <w:bottom w:type="dxa" w:w="80"/>
+              <w:right w:type="dxa" w:w="120"/>
+            </w:tcMar>
+          </w:tcPr>
+          <w:p>
+            <w:pPr>
+              <w:spacing w:after="0"/>
+            </w:pPr>
+            <w:r>
+              <w:rPr>
+                <w:rFonts w:ascii="Calibri" w:cs="Calibri" w:eastAsia="Calibri" w:hAnsi="Calibri"/>
+                <w:b w:val="false"/>
+                <w:bCs w:val="false"/>
+                <w:sz w:val="20"/>
+                <w:szCs w:val="20"/>
+              </w:rPr>
+              <w:t xml:space="preserve">3</w:t>
+            </w:r>
+          </w:p>
+        </w:tc>
+        <w:tc>
+          <w:tcPr>
+            <w:tcW w:type="dxa" w:w="8160"/>
+            <w:tcMar>
+              <w:top w:type="dxa" w:w="80"/>
+              <w:left w:type="dxa" w:w="120"/>
+              <w:bottom w:type="dxa" w:w="80"/>
+              <w:right w:type="dxa" w:w="120"/>
+            </w:tcMar>
+          </w:tcPr>
+          <w:p>
+            <w:pPr>
+              <w:spacing w:after="0"/>
+            </w:pPr>
+            <w:r>
+              <w:rPr>
+                <w:rFonts w:ascii="Calibri" w:cs="Calibri" w:eastAsia="Calibri" w:hAnsi="Calibri"/>
+                <w:b w:val="false"/>
+                <w:bCs w:val="false"/>
+                <w:sz w:val="20"/>
+                <w:szCs w:val="20"/>
+              </w:rPr>
+              <w:t xml:space="preserve">POO: Tienda orquestadora del menu y punto de entrada mainCarrito</w:t>
+            </w:r>
+          </w:p>
+        </w:tc>
+      </w:tr>
+      <w:tr>
+        <w:tc>
+          <w:tcPr>
+            <w:tcW w:type="dxa" w:w="1200"/>
+            <w:tcMar>
+              <w:top w:type="dxa" w:w="80"/>
+              <w:left w:type="dxa" w:w="120"/>
+              <w:bottom w:type="dxa" w:w="80"/>
+              <w:right w:type="dxa" w:w="120"/>
+            </w:tcMar>
+          </w:tcPr>
+          <w:p>
+            <w:pPr>
+              <w:spacing w:after="0"/>
+            </w:pPr>
+            <w:r>
+              <w:rPr>
+                <w:rFonts w:ascii="Calibri" w:cs="Calibri" w:eastAsia="Calibri" w:hAnsi="Calibri"/>
+                <w:b w:val="false"/>
+                <w:bCs w:val="false"/>
+                <w:sz w:val="20"/>
+                <w:szCs w:val="20"/>
+              </w:rPr>
+              <w:t xml:space="preserve">4</w:t>
+            </w:r>
+          </w:p>
+        </w:tc>
+        <w:tc>
+          <w:tcPr>
+            <w:tcW w:type="dxa" w:w="8160"/>
+            <w:tcMar>
+              <w:top w:type="dxa" w:w="80"/>
+              <w:left w:type="dxa" w:w="120"/>
+              <w:bottom w:type="dxa" w:w="80"/>
+              <w:right w:type="dxa" w:w="120"/>
+            </w:tcMar>
+          </w:tcPr>
+          <w:p>
+            <w:pPr>
+              <w:spacing w:after="0"/>
+            </w:pPr>
+            <w:r>
+              <w:rPr>
+                <w:rFonts w:ascii="Calibri" w:cs="Calibri" w:eastAsia="Calibri" w:hAnsi="Calibri"/>
+                <w:b w:val="false"/>
+                <w:bCs w:val="false"/>
+                <w:sz w:val="20"/>
+                <w:szCs w:val="20"/>
+              </w:rPr>
+              <w:t xml:space="preserve">POO: metodos quitarProducto y vaciar para administrar el Carrito</w:t>
+            </w:r>
+          </w:p>
+        </w:tc>
+      </w:tr>
+      <w:tr>
+        <w:tc>
+          <w:tcPr>
+            <w:tcW w:type="dxa" w:w="1200"/>
+            <w:tcMar>
+              <w:top w:type="dxa" w:w="80"/>
+              <w:left w:type="dxa" w:w="120"/>
+              <w:bottom w:type="dxa" w:w="80"/>
+              <w:right w:type="dxa" w:w="120"/>
+            </w:tcMar>
+          </w:tcPr>
+          <w:p>
+            <w:pPr>
+              <w:spacing w:after="0"/>
+            </w:pPr>
+            <w:r>
+              <w:rPr>
+                <w:rFonts w:ascii="Calibri" w:cs="Calibri" w:eastAsia="Calibri" w:hAnsi="Calibri"/>
+                <w:b w:val="false"/>
+                <w:bCs w:val="false"/>
+                <w:sz w:val="20"/>
+                <w:szCs w:val="20"/>
+              </w:rPr>
+              <w:t xml:space="preserve">5</w:t>
+            </w:r>
+          </w:p>
+        </w:tc>
+        <w:tc>
+          <w:tcPr>
+            <w:tcW w:type="dxa" w:w="8160"/>
+            <w:tcMar>
+              <w:top w:type="dxa" w:w="80"/>
+              <w:left w:type="dxa" w:w="120"/>
+              <w:bottom w:type="dxa" w:w="80"/>
+              <w:right w:type="dxa" w:w="120"/>
+            </w:tcMar>
+          </w:tcPr>
+          <w:p>
+            <w:pPr>
+              <w:spacing w:after="0"/>
+            </w:pPr>
+            <w:r>
+              <w:rPr>
+                <w:rFonts w:ascii="Calibri" w:cs="Calibri" w:eastAsia="Calibri" w:hAnsi="Calibri"/>
+                <w:b w:val="false"/>
+                <w:bCs w:val="false"/>
+                <w:sz w:val="20"/>
+                <w:szCs w:val="20"/>
+              </w:rPr>
+              <w:t xml:space="preserve">POO: estrategia SinDescuento intercambiable mediante la interfaz CalculadoraDescuento</w:t>
+            </w:r>
+          </w:p>
+        </w:tc>
+      </w:tr>
+      <w:tr>
+        <w:tc>
+          <w:tcPr>
+            <w:tcW w:type="dxa" w:w="1200"/>
+            <w:tcMar>
+              <w:top w:type="dxa" w:w="80"/>
+              <w:left w:type="dxa" w:w="120"/>
+              <w:bottom w:type="dxa" w:w="80"/>
+              <w:right w:type="dxa" w:w="120"/>
+            </w:tcMar>
+          </w:tcPr>
+          <w:p>
+            <w:pPr>
+              <w:spacing w:after="0"/>
+            </w:pPr>
+            <w:r>
+              <w:rPr>
+                <w:rFonts w:ascii="Calibri" w:cs="Calibri" w:eastAsia="Calibri" w:hAnsi="Calibri"/>
+                <w:b w:val="false"/>
+                <w:bCs w:val="false"/>
+                <w:sz w:val="20"/>
+                <w:szCs w:val="20"/>
+              </w:rPr>
+              <w:t xml:space="preserve">6</w:t>
+            </w:r>
+          </w:p>
+        </w:tc>
+        <w:tc>
+          <w:tcPr>
+            <w:tcW w:type="dxa" w:w="8160"/>
+            <w:tcMar>
+              <w:top w:type="dxa" w:w="80"/>
+              <w:left w:type="dxa" w:w="120"/>
+              <w:bottom w:type="dxa" w:w="80"/>
+              <w:right w:type="dxa" w:w="120"/>
+            </w:tcMar>
+          </w:tcPr>
+          <w:p>
+            <w:pPr>
+              <w:spacing w:after="0"/>
+            </w:pPr>
+            <w:r>
+              <w:rPr>
+                <w:rFonts w:ascii="Calibri" w:cs="Calibri" w:eastAsia="Calibri" w:hAnsi="Calibri"/>
+                <w:b w:val="false"/>
+                <w:bCs w:val="false"/>
+                <w:sz w:val="20"/>
+                <w:szCs w:val="20"/>
+              </w:rPr>
+              <w:t xml:space="preserve">POO: lectura segura de opciones en la Tienda (validacion de entradas no numericas)</w:t>
+            </w:r>
+          </w:p>
+        </w:tc>
+      </w:tr>
+      <w:tr>
+        <w:tc>
+          <w:tcPr>
+            <w:tcW w:type="dxa" w:w="1200"/>
+            <w:tcMar>
+              <w:top w:type="dxa" w:w="80"/>
+              <w:left w:type="dxa" w:w="120"/>
+              <w:bottom w:type="dxa" w:w="80"/>
+              <w:right w:type="dxa" w:w="120"/>
+            </w:tcMar>
+          </w:tcPr>
+          <w:p>
+            <w:pPr>
+              <w:spacing w:after="0"/>
+            </w:pPr>
+            <w:r>
+              <w:rPr>
+                <w:rFonts w:ascii="Calibri" w:cs="Calibri" w:eastAsia="Calibri" w:hAnsi="Calibri"/>
+                <w:b w:val="false"/>
+                <w:bCs w:val="false"/>
+                <w:sz w:val="20"/>
+                <w:szCs w:val="20"/>
+              </w:rPr>
+              <w:t xml:space="preserve">7</w:t>
+            </w:r>
+          </w:p>
+        </w:tc>
+        <w:tc>
+          <w:tcPr>
+            <w:tcW w:type="dxa" w:w="8160"/>
+            <w:tcMar>
+              <w:top w:type="dxa" w:w="80"/>
+              <w:left w:type="dxa" w:w="120"/>
+              <w:bottom w:type="dxa" w:w="80"/>
+              <w:right w:type="dxa" w:w="120"/>
+            </w:tcMar>
+          </w:tcPr>
+          <w:p>
+            <w:pPr>
+              <w:spacing w:after="0"/>
+            </w:pPr>
+            <w:r>
+              <w:rPr>
+                <w:rFonts w:ascii="Calibri" w:cs="Calibri" w:eastAsia="Calibri" w:hAnsi="Calibri"/>
+                <w:b w:val="false"/>
+                <w:bCs w:val="false"/>
+                <w:sz w:val="20"/>
+                <w:szCs w:val="20"/>
+              </w:rPr>
+              <w:t xml:space="preserve">POO: opcion del menu para quitar productos del carrito</w:t>
+            </w:r>
+          </w:p>
+        </w:tc>
+      </w:tr>
+      <w:tr>
+        <w:tc>
+          <w:tcPr>
+            <w:tcW w:type="dxa" w:w="1200"/>
+            <w:tcMar>
+              <w:top w:type="dxa" w:w="80"/>
+              <w:left w:type="dxa" w:w="120"/>
+              <w:bottom w:type="dxa" w:w="80"/>
+              <w:right w:type="dxa" w:w="120"/>
+            </w:tcMar>
+          </w:tcPr>
+          <w:p>
+            <w:pPr>
+              <w:spacing w:after="0"/>
+            </w:pPr>
+            <w:r>
+              <w:rPr>
+                <w:rFonts w:ascii="Calibri" w:cs="Calibri" w:eastAsia="Calibri" w:hAnsi="Calibri"/>
+                <w:b w:val="false"/>
+                <w:bCs w:val="false"/>
+                <w:sz w:val="20"/>
+                <w:szCs w:val="20"/>
+              </w:rPr>
+              <w:t xml:space="preserve">8</w:t>
+            </w:r>
+          </w:p>
+        </w:tc>
+        <w:tc>
+          <w:tcPr>
+            <w:tcW w:type="dxa" w:w="8160"/>
+            <w:tcMar>
+              <w:top w:type="dxa" w:w="80"/>
+              <w:left w:type="dxa" w:w="120"/>
+              <w:bottom w:type="dxa" w:w="80"/>
+              <w:right w:type="dxa" w:w="120"/>
+            </w:tcMar>
+          </w:tcPr>
+          <w:p>
+            <w:pPr>
+              <w:spacing w:after="0"/>
+            </w:pPr>
+            <w:r>
+              <w:rPr>
+                <w:rFonts w:ascii="Calibri" w:cs="Calibri" w:eastAsia="Calibri" w:hAnsi="Calibri"/>
+                <w:b w:val="false"/>
+                <w:bCs w:val="false"/>
+                <w:sz w:val="20"/>
+                <w:szCs w:val="20"/>
+              </w:rPr>
+              <w:t xml:space="preserve">Documentacion: README de la carpeta POOIA con el disenio de clases y pilares aplicados</w:t>
+            </w:r>
+          </w:p>
+        </w:tc>
+      </w:tr>
+    </w:tbl>
+    <w:p>
+      <w:pPr>
+        <w:spacing w:after="120"/>
+      </w:pPr>
+    </w:p>
+    <w:p>
+      <w:pPr>
+        <w:spacing w:after="160" w:line="300"/>
+        <w:jc w:val="both"/>
+      </w:pPr>
+      <w:r>
+        <w:rPr>
+          <w:rFonts w:ascii="Calibri" w:cs="Calibri" w:eastAsia="Calibri" w:hAnsi="Calibri"/>
+          <w:sz w:val="22"/>
+          <w:szCs w:val="22"/>
+        </w:rPr>
+        <w:t xml:space="preserve">Los commits 4 a 7 no son solo relleno del historial: agregan mejoras reales a la versión POO. El carrito ahora permite quitar productos y vaciarse (quitarProducto y vaciar), existe una segunda estrategia de descuento (SinDescuento) que demuestra el intercambio por interfaz, el menú valida entradas no numéricas sin que el programa se caiga, y se incorporó la opción 6 del menú para quitar un producto del carrito antes de generar el recibo.</w:t>
+      </w:r>
+    </w:p>
+    <w:p>
+      <w:pPr>
+        <w:spacing w:after="160" w:line="300"/>
+        <w:jc w:val="both"/>
+      </w:pPr>
+      <w:r>
+        <w:rPr>
+          <w:rFonts w:ascii="Calibri" w:cs="Calibri" w:eastAsia="Calibri" w:hAnsi="Calibri"/>
+          <w:sz w:val="22"/>
+          <w:szCs w:val="22"/>
+        </w:rPr>
+        <w:t xml:space="preserve">La rama quedó activa en el repositorio local; para publicarla en GitHub debe ejecutarse desde la máquina local:</w:t>
       </w:r>
     </w:p>
     <w:p>
@@ -2307,7 +2852,7 @@
           <w:sz w:val="22"/>
           <w:szCs w:val="22"/>
         </w:rPr>
-        <w:t xml:space="preserve">Los archivos de la versión anterior (carrito.main.kt y MainActivity.kt) no fueron modificados: la rama solo agrega los ocho archivos nuevos de la carpeta POOIA.</w:t>
+        <w:t xml:space="preserve">Los archivos de la versión anterior (carrito.main.kt y MainActivity.kt) no fueron modificados: la rama solo agrega los archivos nuevos de la carpeta POOIA y esta documentación.</w:t>
       </w:r>
     </w:p>
     <w:p>

</xml_diff>